<commit_message>
gis and guide changes
</commit_message>
<xml_diff>
--- a/USER_GUIDE_(UPDATED)V3.docx
+++ b/USER_GUIDE_(UPDATED)V3.docx
@@ -163,7 +163,122 @@
         <w:spacing w:before="160"/>
       </w:pPr>
       <w:r>
-        <w:t>1.2 Open the Project List</w:t>
+        <w:t>1.2 User Login</w:t>
+      </w:r>
+    </w:p>
+    <w:p>
+      <w:r>
+        <w:t>When you open PSAT, the Landing Page lists every profile registered on this device.</w:t>
+      </w:r>
+    </w:p>
+    <w:p>
+      <w:pPr>
+        <w:pStyle w:val="ListNumber"/>
+      </w:pPr>
+      <w:r>
+        <w:t>Click your profile card — it highlights in green to show it is selected.</w:t>
+      </w:r>
+    </w:p>
+    <w:p>
+      <w:pPr>
+        <w:pStyle w:val="ListNumber"/>
+      </w:pPr>
+      <w:r>
+        <w:t xml:space="preserve">Click </w:t>
+      </w:r>
+      <w:r>
+        <w:rPr>
+          <w:b/>
+        </w:rPr>
+        <w:t>Start As &lt;Name&gt;</w:t>
+      </w:r>
+      <w:r>
+        <w:t>. A PIN prompt appears if this is not the currently active session.</w:t>
+      </w:r>
+    </w:p>
+    <w:p>
+      <w:pPr>
+        <w:pStyle w:val="ListNumber"/>
+      </w:pPr>
+      <w:r>
+        <w:t>Enter your 4–12 digit numeric PIN and confirm.</w:t>
+      </w:r>
+    </w:p>
+    <w:p>
+      <w:pPr>
+        <w:pStyle w:val="ListNumber"/>
+      </w:pPr>
+      <w:r>
+        <w:t xml:space="preserve">You are now logged in and taken to your </w:t>
+      </w:r>
+      <w:r>
+        <w:rPr>
+          <w:b/>
+        </w:rPr>
+        <w:t>Projects</w:t>
+      </w:r>
+      <w:r>
+        <w:t xml:space="preserve"> page.</w:t>
+      </w:r>
+    </w:p>
+    <w:p>
+      <w:r>
+        <w:t xml:space="preserve">To create a new profile, click </w:t>
+      </w:r>
+      <w:r>
+        <w:rPr>
+          <w:b/>
+        </w:rPr>
+        <w:t>Create Profile</w:t>
+      </w:r>
+      <w:r>
+        <w:t>, enter your LTA Employee Email, Division, and a 4–12 digit numeric PIN, then click </w:t>
+      </w:r>
+      <w:r>
+        <w:rPr>
+          <w:b/>
+        </w:rPr>
+        <w:t>Create Profile</w:t>
+      </w:r>
+      <w:r>
+        <w:t>.</w:t>
+      </w:r>
+    </w:p>
+    <w:p>
+      <w:r>
+        <w:t xml:space="preserve">To switch accounts, click </w:t>
+      </w:r>
+      <w:r>
+        <w:rPr>
+          <w:b/>
+        </w:rPr>
+        <w:t>Log Out</w:t>
+      </w:r>
+      <w:r>
+        <w:t> in the left-hand sidebar and select a different profile on the Landing Page.</w:t>
+      </w:r>
+    </w:p>
+    <w:p>
+      <w:pPr>
+        <w:pBdr>
+          <w:left w:val="single" w:sz="12" w:space="4" w:color="3182CE"/>
+        </w:pBdr>
+      </w:pPr>
+      <w:r>
+        <w:rPr>
+          <w:i/>
+          <w:color w:val="4A5568"/>
+        </w:rPr>
+        <w:t>For full login and account management instructions, see Section 2: User Login &amp; Account Management.</w:t>
+      </w:r>
+    </w:p>
+    <w:p>
+      <w:pPr>
+        <w:pStyle w:val="Heading3"/>
+        <w:spacing w:before="160"/>
+      </w:pPr>
+      <w:r>
+        <w:t>1.3 Open the Project List</w:t>
       </w:r>
     </w:p>
     <w:p>
@@ -218,7 +333,7 @@
         <w:spacing w:before="160"/>
       </w:pPr>
       <w:r>
-        <w:t>1.3 Create a Project</w:t>
+        <w:t>1.4 Create a Project</w:t>
       </w:r>
     </w:p>
     <w:p>
@@ -370,7 +485,7 @@
         <w:spacing w:before="160"/>
       </w:pPr>
       <w:r>
-        <w:t>1.4 Navigate Between Workflows</w:t>
+        <w:t>1.5 Navigate Between Workflows</w:t>
       </w:r>
     </w:p>
     <w:p>
@@ -636,7 +751,7 @@
         <w:spacing w:before="160"/>
       </w:pPr>
       <w:r>
-        <w:t>1.5 Viewing and Updating GIS Layers</w:t>
+        <w:t>1.6 Viewing and Updating GIS Layers</w:t>
       </w:r>
     </w:p>
     <w:p>

</xml_diff>

<commit_message>
new features added to user guide
</commit_message>
<xml_diff>
--- a/USER_GUIDE_(UPDATED)V3.docx
+++ b/USER_GUIDE_(UPDATED)V3.docx
@@ -260,10 +260,20 @@
     </w:p>
     <w:p>
       <w:r>
+        <w:t>Creating a new profile — click Create Profile on the Landing Page and fill in: Username (display name shown on the landing page), LTA Employee Email (e.g. user@lta.gov.sg) — this is your private-facing email used only for identity verification and PIN recovery; it is not displayed publicly, Division, and a 4-12 digit numeric PIN. Then click Create Profile to complete setup.</w:t>
+      </w:r>
+    </w:p>
+    <w:p>
+      <w:r>
+        <w:t>Signing in — click your profile card on the Landing Page, click Start As &lt;Username&gt;, enter your PIN, and you are taken to your Projects page.</w:t>
+      </w:r>
+    </w:p>
+    <w:p>
+      <w:r>
         <w:rPr>
           <w:b/>
         </w:rPr>
-        <w:t>Creating a new profile</w:t>
+        <w:t>Switching accounts</w:t>
       </w:r>
       <w:r>
         <w:t xml:space="preserve"> — click </w:t>
@@ -272,19 +282,10 @@
         <w:rPr>
           <w:b/>
         </w:rPr>
-        <w:t>Create Profile</w:t>
-      </w:r>
-      <w:r>
-        <w:t xml:space="preserve"> on the Landing Page, enter your </w:t>
-      </w:r>
-      <w:r>
-        <w:rPr>
-          <w:b/>
-        </w:rPr>
-        <w:t>LTA Employee Email</w:t>
-      </w:r>
-      <w:r>
-        <w:t xml:space="preserve"> (e.g. </w:t>
+        <w:t>Log Out</w:t>
+      </w:r>
+      <w:r>
+        <w:t xml:space="preserve"> in the left-hand sidebar at any time and select a different profile (identified by your LTA Employee Email, e.g. </w:t>
       </w:r>
       <w:r>
         <w:rPr>
@@ -294,83 +295,6 @@
         <w:t>user@lta.gov.sg</w:t>
       </w:r>
       <w:r>
-        <w:t xml:space="preserve">), your </w:t>
-      </w:r>
-      <w:r>
-        <w:rPr>
-          <w:b/>
-        </w:rPr>
-        <w:t>Division</w:t>
-      </w:r>
-      <w:r>
-        <w:t xml:space="preserve">, and a 4–12 digit numeric PIN, then click </w:t>
-      </w:r>
-      <w:r>
-        <w:rPr>
-          <w:b/>
-        </w:rPr>
-        <w:t>Create Profile</w:t>
-      </w:r>
-      <w:r>
-        <w:t>.</w:t>
-      </w:r>
-    </w:p>
-    <w:p>
-      <w:r>
-        <w:rPr>
-          <w:b/>
-        </w:rPr>
-        <w:t>Signing in</w:t>
-      </w:r>
-      <w:r>
-        <w:t xml:space="preserve"> — click your profile card on the Landing Page, click </w:t>
-      </w:r>
-      <w:r>
-        <w:rPr>
-          <w:b/>
-        </w:rPr>
-        <w:t>Start As \&lt;LTA Email Address\&gt;</w:t>
-      </w:r>
-      <w:r>
-        <w:t xml:space="preserve">, enter your PIN, and you are taken to your </w:t>
-      </w:r>
-      <w:r>
-        <w:rPr>
-          <w:b/>
-        </w:rPr>
-        <w:t>Projects</w:t>
-      </w:r>
-      <w:r>
-        <w:t xml:space="preserve"> page.</w:t>
-      </w:r>
-    </w:p>
-    <w:p>
-      <w:r>
-        <w:rPr>
-          <w:b/>
-        </w:rPr>
-        <w:t>Switching accounts</w:t>
-      </w:r>
-      <w:r>
-        <w:t xml:space="preserve"> — click </w:t>
-      </w:r>
-      <w:r>
-        <w:rPr>
-          <w:b/>
-        </w:rPr>
-        <w:t>Log Out</w:t>
-      </w:r>
-      <w:r>
-        <w:t xml:space="preserve"> in the left-hand sidebar at any time and select a different profile (identified by your LTA Employee Email, e.g. </w:t>
-      </w:r>
-      <w:r>
-        <w:rPr>
-          <w:rFonts w:ascii="Courier New" w:hAnsi="Courier New"/>
-          <w:sz w:val="18"/>
-        </w:rPr>
-        <w:t>user@lta.gov.sg</w:t>
-      </w:r>
-      <w:r>
         <w:t>) on the Landing Page.</w:t>
       </w:r>
     </w:p>
@@ -417,15 +341,44 @@
     </w:p>
     <w:p>
       <w:r>
-        <w:rPr>
-          <w:b/>
-        </w:rPr>
-        <w:t>Forgotten PIN</w:t>
-      </w:r>
-    </w:p>
-    <w:p>
-      <w:r>
-        <w:t>PINs are stored locally and there is no self-service reset. Ask your administrator to delete and recreate the profile if the PIN is irrecoverable. Note that deleting a profile removes all projects associated with it.</w:t>
+        <w:t>Forgotten PIN / Restore Password</w:t>
+      </w:r>
+    </w:p>
+    <w:p>
+      <w:r>
+        <w:t>If you have forgotten your PIN, you can restore access using your registered private-facing email:</w:t>
+      </w:r>
+    </w:p>
+    <w:p>
+      <w:pPr>
+        <w:pStyle w:val="ListNumber"/>
+      </w:pPr>
+      <w:r>
+        <w:t xml:space="preserve">On the Landing Page, click Forgot PIN? (or the equivalent restore option) below the sign-in prompt.</w:t>
+      </w:r>
+    </w:p>
+    <w:p>
+      <w:pPr>
+        <w:pStyle w:val="ListNumber"/>
+      </w:pPr>
+      <w:r>
+        <w:t xml:space="preserve">Enter the email address you provided when creating your profile.</w:t>
+      </w:r>
+    </w:p>
+    <w:p>
+      <w:pPr>
+        <w:pStyle w:val="ListNumber"/>
+      </w:pPr>
+      <w:r>
+        <w:t xml:space="preserve">Follow the verification instructions sent to that email to reset your PIN.</w:t>
+      </w:r>
+    </w:p>
+    <w:p>
+      <w:pPr>
+        <w:pStyle w:val="Quote"/>
+      </w:pPr>
+      <w:r>
+        <w:t xml:space="preserve">If you no longer have access to your registered email, ask your administrator to delete and recreate the profile. Note that deleting a profile removes all projects associated with it.</w:t>
       </w:r>
     </w:p>
     <w:p>
@@ -8378,6 +8331,14 @@
     </w:p>
     <w:p>
       <w:pPr>
+        <w:pStyle w:val="Quote"/>
+      </w:pPr>
+      <w:r>
+        <w:t xml:space="preserve">Fixed Obstacle Types and Non-Fixed Obstacle Types are now standardised. Any obstacle sub-type that is not within the preset values (Lamp Post, Traffic Light, Pillar, Bollards, Fence, Vegetation for fixed; Barrier, Bins, Bicycle, Cone for non-fixed) will be automatically assigned as Others. This ensures consistent filtering across all projects.</w:t>
+      </w:r>
+    </w:p>
+    <w:p>
+      <w:pPr>
         <w:pStyle w:val="Heading3"/>
       </w:pPr>
       <w:r>
@@ -8624,6 +8585,14 @@
       </w:r>
       <w:r>
         <w:t xml:space="preserve"> to return and continue</w:t>
+      </w:r>
+    </w:p>
+    <w:p>
+      <w:pPr>
+        <w:pStyle w:val="Normal"/>
+      </w:pPr>
+      <w:r>
+        <w:t xml:space="preserve">Top Risk Contributors — the panel showing the attributes contributing most to risk scores is reactive to your active filters. As you apply or change segment filters, the Top Risk Contributors list updates automatically to reflect only the filtered subset of segments, so the contributors you see always match the segments currently visible on the map and in the table.</w:t>
       </w:r>
     </w:p>
     <w:p>
@@ -10354,6 +10323,14 @@
     </w:p>
     <w:p>
       <w:pPr>
+        <w:pStyle w:val="Quote"/>
+      </w:pPr>
+      <w:r>
+        <w:t xml:space="preserve">Project names in exports — the project name shown in the CSV and shapefile exports matches exactly what is displayed in the Path Analysis page, ensuring consistency when cross-referencing exported data against the on-screen analysis.</w:t>
+      </w:r>
+    </w:p>
+    <w:p>
+      <w:pPr>
         <w:pStyle w:val="Heading3"/>
       </w:pPr>
       <w:r>
@@ -10389,16 +10366,7 @@
     </w:p>
     <w:p>
       <w:r>
-        <w:t xml:space="preserve">Click </w:t>
-      </w:r>
-      <w:r>
-        <w:rPr>
-          <w:b/>
-        </w:rPr>
-        <w:t>Back to Analysis</w:t>
-      </w:r>
-      <w:r>
-        <w:t xml:space="preserve"> in the sidebar to return to Path Analysis with your filters intact.</w:t>
+        <w:t>Click Back to Analysis in the sidebar to return to Path Analysis with your filters intact. Secondary attribute (finer filter) colours on the map are automatically refreshed when you return — changes made to obstacle types or other sub-category attributes in the Coding page will be reflected immediately without needing to re-apply the filter.</w:t>
       </w:r>
     </w:p>
     <w:p>
@@ -12127,7 +12095,12 @@
         <w:pStyle w:val="Quote"/>
       </w:pPr>
       <w:r>
-        <w:t xml:space="preserve">[!IMPORTANT] The </w:t>
+        <w:t>IMPORTANT: The Show Post-Treatment toggle (located in the Attributes panel header on the right) must be switched on to see the live preview of the post-treatment risk scores and attribute changes. Switching it back to Show Pre-Treatment correctly restores the original (pre-treatment) scores and attributes — the score display refreshes automatically in both directions.</w:t>
+      </w:r>
+    </w:p>
+    <w:p>
+      <w:r>
+        <w:t xml:space="preserve">Once the </w:t>
       </w:r>
       <w:r>
         <w:rPr>
@@ -12136,21 +12109,208 @@
         <w:t>Show Post-Treatment</w:t>
       </w:r>
       <w:r>
-        <w:t xml:space="preserve"> toggle (located in the Attributes panel header on the right) must be switched </w:t>
+        <w:t xml:space="preserve"> toggle is enabled, selecting a treatment will show a </w:t>
       </w:r>
       <w:r>
         <w:rPr>
           <w:b/>
         </w:rPr>
-        <w:t>on</w:t>
-      </w:r>
-      <w:r>
-        <w:t xml:space="preserve"> to see the live preview of the post-treatment risk scores and attribute changes. If this is toggled off, only the original (pre-treatment) scores will be displayed.</w:t>
-      </w:r>
-    </w:p>
-    <w:p>
-      <w:r>
-        <w:t xml:space="preserve">Once the </w:t>
+        <w:t>live preview</w:t>
+      </w:r>
+      <w:r>
+        <w:t xml:space="preserve"> in the </w:t>
+      </w:r>
+      <w:r>
+        <w:rPr>
+          <w:b/>
+        </w:rPr>
+        <w:t>Scores card</w:t>
+      </w:r>
+      <w:r>
+        <w:t xml:space="preserve"> on the right of what the risk scores would look like if you applied those treatments to the current segment. The preview updates automatically whenever you change your selection — you do not need to click anything to trigger it.</w:t>
+      </w:r>
+    </w:p>
+    <w:p>
+      <w:r>
+        <w:t>With the toggle on, the attributes panel also updates to display exactly which attribute values would change if the selected treatments were applied, so you can understand the reasoning behind the score change.</w:t>
+      </w:r>
+    </w:p>
+    <w:p>
+      <w:pPr>
+        <w:pStyle w:val="Quote"/>
+      </w:pPr>
+      <w:r>
+        <w:rPr>
+          <w:b/>
+        </w:rPr>
+        <w:t>Note:</w:t>
+      </w:r>
+      <w:r>
+        <w:t xml:space="preserve"> Selecting treatments only previews the effect — nothing is saved until you click Apply.</w:t>
+      </w:r>
+    </w:p>
+    <w:p>
+      <w:pPr>
+        <w:pStyle w:val="Heading3"/>
+      </w:pPr>
+      <w:r>
+        <w:t>Step 5: Apply treatments</w:t>
+      </w:r>
+    </w:p>
+    <w:p>
+      <w:r>
+        <w:t xml:space="preserve">When you are satisfied with your selection, click </w:t>
+      </w:r>
+      <w:r>
+        <w:rPr>
+          <w:b/>
+        </w:rPr>
+        <w:t>Apply (N)</w:t>
+      </w:r>
+      <w:r>
+        <w:t xml:space="preserve"> at the bottom of the Treatment Options panel (where </w:t>
+      </w:r>
+      <w:r>
+        <w:rPr>
+          <w:i/>
+        </w:rPr>
+        <w:t>N</w:t>
+      </w:r>
+      <w:r>
+        <w:t xml:space="preserve"> is the number of treatments selected):</w:t>
+      </w:r>
+    </w:p>
+    <w:p>
+      <w:pPr>
+        <w:pStyle w:val="ListBullet"/>
+      </w:pPr>
+      <w:r>
+        <w:rPr>
+          <w:b/>
+        </w:rPr>
+        <w:t>In By Segment mode</w:t>
+      </w:r>
+      <w:r>
+        <w:t>, Apply saves the selected treatments for the current segment only. The treatment colours on the After Treatment map will update for that segment immediately.</w:t>
+      </w:r>
+    </w:p>
+    <w:p>
+      <w:pPr>
+        <w:pStyle w:val="ListBullet"/>
+      </w:pPr>
+      <w:r>
+        <w:rPr>
+          <w:b/>
+        </w:rPr>
+        <w:t>In By Treatment mode</w:t>
+      </w:r>
+      <w:r>
+        <w:t xml:space="preserve">, Apply triggers a confirmation dialog listing each selected treatment and asking whether to apply it to </w:t>
+      </w:r>
+      <w:r>
+        <w:rPr>
+          <w:b/>
+        </w:rPr>
+        <w:t>all eligible segments</w:t>
+      </w:r>
+      <w:r>
+        <w:t xml:space="preserve"> across the loaded project. Confirm to apply in bulk, or cancel to go back.</w:t>
+      </w:r>
+    </w:p>
+    <w:p>
+      <w:r>
+        <w:t xml:space="preserve">If you change your mind about an applied treatment on the current segment, click the </w:t>
+      </w:r>
+      <w:r>
+        <w:rPr>
+          <w:b/>
+        </w:rPr>
+        <w:t>Reset</w:t>
+      </w:r>
+      <w:r>
+        <w:t xml:space="preserve"> button that appears for that treatment to remove it and restore the original scores for that segment.</w:t>
+      </w:r>
+    </w:p>
+    <w:p>
+      <w:pPr>
+        <w:pStyle w:val="Heading3"/>
+      </w:pPr>
+      <w:r>
+        <w:t>Step 6: Read the segment image, scores, and attributes</w:t>
+      </w:r>
+    </w:p>
+    <w:p>
+      <w:r>
+        <w:t xml:space="preserve">The </w:t>
+      </w:r>
+      <w:r>
+        <w:rPr>
+          <w:b/>
+        </w:rPr>
+        <w:t>middle column</w:t>
+      </w:r>
+      <w:r>
+        <w:t xml:space="preserve"> shows the street-level photograph for the current segment. Use </w:t>
+      </w:r>
+      <w:r>
+        <w:rPr>
+          <w:b/>
+        </w:rPr>
+        <w:t>Previous</w:t>
+      </w:r>
+      <w:r>
+        <w:t xml:space="preserve"> and </w:t>
+      </w:r>
+      <w:r>
+        <w:rPr>
+          <w:b/>
+        </w:rPr>
+        <w:t>Next</w:t>
+      </w:r>
+      <w:r>
+        <w:t xml:space="preserve"> to move through segments, or jump to a specific page number.</w:t>
+      </w:r>
+    </w:p>
+    <w:p>
+      <w:r>
+        <w:t xml:space="preserve">The </w:t>
+      </w:r>
+      <w:r>
+        <w:rPr>
+          <w:b/>
+        </w:rPr>
+        <w:t>right column</w:t>
+      </w:r>
+      <w:r>
+        <w:t xml:space="preserve"> shows two panels:</w:t>
+      </w:r>
+    </w:p>
+    <w:p>
+      <w:pPr>
+        <w:pStyle w:val="ListBullet"/>
+      </w:pPr>
+      <w:r>
+        <w:rPr>
+          <w:b/>
+        </w:rPr>
+        <w:t>Segment Scores</w:t>
+      </w:r>
+      <w:r>
+        <w:t xml:space="preserve"> — displays the four CycleRAP risk scores for the current segment: Vehicle-Bicycle (VB), Bicycle-Pedestrian (BP), Single-Bicycle (SB), and Bicycle-Bicycle (BB). When treatments are selected, this panel shows the previewed scores alongside the original scores so you can compare.</w:t>
+      </w:r>
+    </w:p>
+    <w:p>
+      <w:pPr>
+        <w:pStyle w:val="ListBullet"/>
+      </w:pPr>
+      <w:r>
+        <w:rPr>
+          <w:b/>
+        </w:rPr>
+        <w:t>Attributes panel</w:t>
+      </w:r>
+      <w:r>
+        <w:t xml:space="preserve"> — lists all coded attribute values for the current segment. Toggle </w:t>
       </w:r>
       <w:r>
         <w:rPr>
@@ -12159,216 +12319,6 @@
         <w:t>Show Post-Treatment</w:t>
       </w:r>
       <w:r>
-        <w:t xml:space="preserve"> toggle is enabled, selecting a treatment will show a </w:t>
-      </w:r>
-      <w:r>
-        <w:rPr>
-          <w:b/>
-        </w:rPr>
-        <w:t>live preview</w:t>
-      </w:r>
-      <w:r>
-        <w:t xml:space="preserve"> in the </w:t>
-      </w:r>
-      <w:r>
-        <w:rPr>
-          <w:b/>
-        </w:rPr>
-        <w:t>Scores card</w:t>
-      </w:r>
-      <w:r>
-        <w:t xml:space="preserve"> on the right of what the risk scores would look like if you applied those treatments to the current segment. The preview updates automatically whenever you change your selection — you do not need to click anything to trigger it.</w:t>
-      </w:r>
-    </w:p>
-    <w:p>
-      <w:r>
-        <w:t>With the toggle on, the attributes panel also updates to display exactly which attribute values would change if the selected treatments were applied, so you can understand the reasoning behind the score change.</w:t>
-      </w:r>
-    </w:p>
-    <w:p>
-      <w:pPr>
-        <w:pStyle w:val="Quote"/>
-      </w:pPr>
-      <w:r>
-        <w:rPr>
-          <w:b/>
-        </w:rPr>
-        <w:t>Note:</w:t>
-      </w:r>
-      <w:r>
-        <w:t xml:space="preserve"> Selecting treatments only previews the effect — nothing is saved until you click Apply.</w:t>
-      </w:r>
-    </w:p>
-    <w:p>
-      <w:pPr>
-        <w:pStyle w:val="Heading3"/>
-      </w:pPr>
-      <w:r>
-        <w:t>Step 5: Apply treatments</w:t>
-      </w:r>
-    </w:p>
-    <w:p>
-      <w:r>
-        <w:t xml:space="preserve">When you are satisfied with your selection, click </w:t>
-      </w:r>
-      <w:r>
-        <w:rPr>
-          <w:b/>
-        </w:rPr>
-        <w:t>Apply (N)</w:t>
-      </w:r>
-      <w:r>
-        <w:t xml:space="preserve"> at the bottom of the Treatment Options panel (where </w:t>
-      </w:r>
-      <w:r>
-        <w:rPr>
-          <w:i/>
-        </w:rPr>
-        <w:t>N</w:t>
-      </w:r>
-      <w:r>
-        <w:t xml:space="preserve"> is the number of treatments selected):</w:t>
-      </w:r>
-    </w:p>
-    <w:p>
-      <w:pPr>
-        <w:pStyle w:val="ListBullet"/>
-      </w:pPr>
-      <w:r>
-        <w:rPr>
-          <w:b/>
-        </w:rPr>
-        <w:t>In By Segment mode</w:t>
-      </w:r>
-      <w:r>
-        <w:t>, Apply saves the selected treatments for the current segment only. The treatment colours on the After Treatment map will update for that segment immediately.</w:t>
-      </w:r>
-    </w:p>
-    <w:p>
-      <w:pPr>
-        <w:pStyle w:val="ListBullet"/>
-      </w:pPr>
-      <w:r>
-        <w:rPr>
-          <w:b/>
-        </w:rPr>
-        <w:t>In By Treatment mode</w:t>
-      </w:r>
-      <w:r>
-        <w:t xml:space="preserve">, Apply triggers a confirmation dialog listing each selected treatment and asking whether to apply it to </w:t>
-      </w:r>
-      <w:r>
-        <w:rPr>
-          <w:b/>
-        </w:rPr>
-        <w:t>all eligible segments</w:t>
-      </w:r>
-      <w:r>
-        <w:t xml:space="preserve"> across the loaded project. Confirm to apply in bulk, or cancel to go back.</w:t>
-      </w:r>
-    </w:p>
-    <w:p>
-      <w:r>
-        <w:t xml:space="preserve">If you change your mind about an applied treatment on the current segment, click the </w:t>
-      </w:r>
-      <w:r>
-        <w:rPr>
-          <w:b/>
-        </w:rPr>
-        <w:t>Reset</w:t>
-      </w:r>
-      <w:r>
-        <w:t xml:space="preserve"> button that appears for that treatment to remove it and restore the original scores for that segment.</w:t>
-      </w:r>
-    </w:p>
-    <w:p>
-      <w:pPr>
-        <w:pStyle w:val="Heading3"/>
-      </w:pPr>
-      <w:r>
-        <w:t>Step 6: Read the segment image, scores, and attributes</w:t>
-      </w:r>
-    </w:p>
-    <w:p>
-      <w:r>
-        <w:t xml:space="preserve">The </w:t>
-      </w:r>
-      <w:r>
-        <w:rPr>
-          <w:b/>
-        </w:rPr>
-        <w:t>middle column</w:t>
-      </w:r>
-      <w:r>
-        <w:t xml:space="preserve"> shows the street-level photograph for the current segment. Use </w:t>
-      </w:r>
-      <w:r>
-        <w:rPr>
-          <w:b/>
-        </w:rPr>
-        <w:t>Previous</w:t>
-      </w:r>
-      <w:r>
-        <w:t xml:space="preserve"> and </w:t>
-      </w:r>
-      <w:r>
-        <w:rPr>
-          <w:b/>
-        </w:rPr>
-        <w:t>Next</w:t>
-      </w:r>
-      <w:r>
-        <w:t xml:space="preserve"> to move through segments, or jump to a specific page number.</w:t>
-      </w:r>
-    </w:p>
-    <w:p>
-      <w:r>
-        <w:t xml:space="preserve">The </w:t>
-      </w:r>
-      <w:r>
-        <w:rPr>
-          <w:b/>
-        </w:rPr>
-        <w:t>right column</w:t>
-      </w:r>
-      <w:r>
-        <w:t xml:space="preserve"> shows two panels:</w:t>
-      </w:r>
-    </w:p>
-    <w:p>
-      <w:pPr>
-        <w:pStyle w:val="ListBullet"/>
-      </w:pPr>
-      <w:r>
-        <w:rPr>
-          <w:b/>
-        </w:rPr>
-        <w:t>Segment Scores</w:t>
-      </w:r>
-      <w:r>
-        <w:t xml:space="preserve"> — displays the four CycleRAP risk scores for the current segment: Vehicle-Bicycle (VB), Bicycle-Pedestrian (BP), Single-Bicycle (SB), and Bicycle-Bicycle (BB). When treatments are selected, this panel shows the previewed scores alongside the original scores so you can compare.</w:t>
-      </w:r>
-    </w:p>
-    <w:p>
-      <w:pPr>
-        <w:pStyle w:val="ListBullet"/>
-      </w:pPr>
-      <w:r>
-        <w:rPr>
-          <w:b/>
-        </w:rPr>
-        <w:t>Attributes panel</w:t>
-      </w:r>
-      <w:r>
-        <w:t xml:space="preserve"> — lists all coded attribute values for the current segment. Toggle </w:t>
-      </w:r>
-      <w:r>
-        <w:rPr>
-          <w:b/>
-        </w:rPr>
-        <w:t>Show Post-Treatment</w:t>
-      </w:r>
-      <w:r>
         <w:t xml:space="preserve"> to switch between the original coded values and the values that would result from the selected treatments.</w:t>
       </w:r>
     </w:p>
@@ -12420,6 +12370,14 @@
     </w:p>
     <w:p>
       <w:pPr>
+        <w:pStyle w:val="Quote"/>
+      </w:pPr>
+      <w:r>
+        <w:t xml:space="preserve">Linked map panels — toggling the visibility or layer state on one map panel automatically applies the same change to the other. Both maps always stay in sync so you are always comparing like with like.</w:t>
+      </w:r>
+    </w:p>
+    <w:p>
+      <w:pPr>
         <w:pStyle w:val="Heading3"/>
       </w:pPr>
       <w:r>
@@ -12428,7 +12386,7 @@
     </w:p>
     <w:p>
       <w:r>
-        <w:t>The Treatment Options panel includes two clipboard buttons that help you create visual representations of proposed improvements using external AI image tools:</w:t>
+        <w:t>The Treatment Options panel has two separate buttons — one for the prompt and one for the image — so each can be copied independently and pasted into AI tools that accept text and image inputs separately (e.g. Gemini, ChatGPT, DALL-E). Prompt templates have been updated to produce clearer, more accurate visualisation instructions.</w:t>
       </w:r>
     </w:p>
     <w:p>
@@ -12436,13 +12394,7 @@
         <w:pStyle w:val="ListBullet"/>
       </w:pPr>
       <w:r>
-        <w:rPr>
-          <w:b/>
-        </w:rPr>
-        <w:t>Copy prompt</w:t>
-      </w:r>
-      <w:r>
-        <w:t xml:space="preserve"> — copies a ready-to-use text prompt describing treatments in plain language. This button has a dropdown with two options:</w:t>
+        <w:t>Copy prompt — copies a ready-to-use text prompt describing treatments in plain language (templates updated for better results). Use the dropdown: Copy Applied (treatments already applied and saved) or Copy Selected (treatments currently ticked in the panel, even if not yet applied).</w:t>
       </w:r>
     </w:p>
     <w:p>
@@ -12501,13 +12453,7 @@
         <w:pStyle w:val="ListBullet"/>
       </w:pPr>
       <w:r>
-        <w:rPr>
-          <w:b/>
-        </w:rPr>
-        <w:t>Copy image</w:t>
-      </w:r>
-      <w:r>
-        <w:t xml:space="preserve"> — copies the current segment photograph directly to your clipboard. Paste it into the same AI tool alongside the prompt so the tool has the actual scene to work from.</w:t>
+        <w:t>Copy image — copies the current segment photograph to your clipboard as a standalone action. Paste it into the AI tool separately from the prompt (pasting both simultaneously into tools like Gemini is not supported).</w:t>
       </w:r>
     </w:p>
     <w:p>
@@ -12912,25 +12858,7 @@
         <w:pStyle w:val="Quote"/>
       </w:pPr>
       <w:r>
-        <w:t xml:space="preserve">[!IMPORTANT] The </w:t>
-      </w:r>
-      <w:r>
-        <w:rPr>
-          <w:b/>
-        </w:rPr>
-        <w:t>Show Post-Treatment</w:t>
-      </w:r>
-      <w:r>
-        <w:t xml:space="preserve"> toggle must be switched </w:t>
-      </w:r>
-      <w:r>
-        <w:rPr>
-          <w:b/>
-        </w:rPr>
-        <w:t>on</w:t>
-      </w:r>
-      <w:r>
-        <w:t xml:space="preserve"> in the Attributes panel header to see the live score preview and attribute modifications. If it is toggled off, the score cards and attribute fields will continue showing the original pre-treatment values.</w:t>
+        <w:t>IMPORTANT: The Show Post-Treatment toggle must be switched on in the Attributes panel header to see the live score preview and attribute modifications. Switching it back to Show Pre-Treatment correctly restores the original pre-treatment scores — the display refreshes automatically in both directions.</w:t>
       </w:r>
     </w:p>
     <w:p>
@@ -13195,11 +13123,7 @@
         <w:pStyle w:val="ListBullet2"/>
       </w:pPr>
       <w:r>
-        <w:rPr>
-          <w:color w:val="3182CE"/>
-          <w:u w:val="single"/>
-        </w:rPr>
-        <w:t>5.4.1 Title</w:t>
+        <w:t>5.4.1 Title and Report Name</w:t>
       </w:r>
     </w:p>
     <w:p>
@@ -13315,11 +13239,15 @@
         <w:pStyle w:val="ListBullet"/>
       </w:pPr>
       <w:r>
-        <w:rPr>
-          <w:color w:val="3182CE"/>
-          <w:u w:val="single"/>
-        </w:rPr>
-        <w:t>5.6 Quick-start Steps</w:t>
+        <w:t>5.6 Saved Reports</w:t>
+      </w:r>
+    </w:p>
+    <w:p>
+      <w:pPr>
+        <w:pStyle w:val="ListBullet"/>
+      </w:pPr>
+      <w:r>
+        <w:t>5.7 Quick-start Steps</w:t>
       </w:r>
     </w:p>
     <w:p>
@@ -13965,7 +13893,7 @@
         <w:pStyle w:val="Heading3"/>
       </w:pPr>
       <w:r>
-        <w:t>5.4.1 Title</w:t>
+        <w:t>5.4.1 Title and Report Name</w:t>
       </w:r>
     </w:p>
     <w:p>
@@ -14059,6 +13987,14 @@
     </w:p>
     <w:p>
       <w:pPr>
+        <w:pStyle w:val="Normal"/>
+      </w:pPr>
+      <w:r>
+        <w:t xml:space="preserve">Report Name (auto-generated): When you generate a report, the system assigns an automatic report name based on the default risk score band of the loaded project(s) (e.g. "High Risk Assessment — Ang Mo Kio"). If you have an active filter applied in the Path Analysis page, the report name will instead reflect the filtered selection — the filtered name takes precedence over the default risk score label. You can always click the heading to override the name manually.</w:t>
+      </w:r>
+    </w:p>
+    <w:p>
+      <w:pPr>
         <w:pStyle w:val="Heading3"/>
       </w:pPr>
       <w:r>
@@ -14178,6 +14114,14 @@
     </w:p>
     <w:p>
       <w:pPr>
+        <w:pStyle w:val="Normal"/>
+      </w:pPr>
+      <w:r>
+        <w:t xml:space="preserve">A legend is displayed alongside the map, showing the colour coding for each risk band so that readers of the exported report can interpret the segment colours without additional context.</w:t>
+      </w:r>
+    </w:p>
+    <w:p>
+      <w:pPr>
         <w:pStyle w:val="Heading3"/>
       </w:pPr>
       <w:r>
@@ -14235,7 +14179,7 @@
     </w:p>
     <w:p>
       <w:r>
-        <w:t>Displays project-level metadata including project name, source road, creation and update dates, and other administrative details for each loaded project.</w:t>
+        <w:t>Displays project-level metadata including project name, source road, creation and update dates, and other administrative details for each loaded project. Entries are sorted by severity — projects with the highest overall risk scores appear first, making it easy to prioritise which projects require the most urgent attention.</w:t>
       </w:r>
     </w:p>
     <w:p>
@@ -14877,6 +14821,54 @@
         <w:t>5.5 Saving, Exporting and Reusing Your Report</w:t>
       </w:r>
     </w:p>
+    <w:p>
+      <w:pPr>
+        <w:pStyle w:val="Quote"/>
+      </w:pPr>
+      <w:r>
+        <w:t xml:space="preserve">Note — Hard Save vs. Layout Save: Save layout stores your preferences locally in the browser only (cleared if you clear browser data). Hard Save writes the report to the server so you can return to it from any device or session.</w:t>
+      </w:r>
+    </w:p>
+    <w:p>
+      <w:pPr>
+        <w:pStyle w:val="ListBullet"/>
+      </w:pPr>
+      <w:r>
+        <w:t xml:space="preserve">Save layout — Click Save layout in the toolbar to persist section order, visibility, and field values to the browser.</w:t>
+      </w:r>
+    </w:p>
+    <w:p>
+      <w:pPr>
+        <w:pStyle w:val="ListBullet"/>
+      </w:pPr>
+      <w:r>
+        <w:t xml:space="preserve">Hard Save — Use Save Report to permanently save the report to the system — it will persist across sessions and can be revisited at any time from any device.</w:t>
+      </w:r>
+    </w:p>
+    <w:p>
+      <w:pPr>
+        <w:pStyle w:val="ListBullet"/>
+      </w:pPr>
+      <w:r>
+        <w:t xml:space="preserve">Reset layout — Click Reset layout to restore the default section order and visibility.</w:t>
+      </w:r>
+    </w:p>
+    <w:p>
+      <w:pPr>
+        <w:pStyle w:val="ListBullet"/>
+      </w:pPr>
+      <w:r>
+        <w:t xml:space="preserve">Export as PDF — Click ↓ PDF — renders the current preview sliced into pages.</w:t>
+      </w:r>
+    </w:p>
+    <w:p>
+      <w:pPr>
+        <w:pStyle w:val="ListBullet"/>
+      </w:pPr>
+      <w:r>
+        <w:t xml:space="preserve">Export as Word — Click ↓ Word — generates a .docx file suitable for editing in Microsoft Word.</w:t>
+      </w:r>
+    </w:p>
     <w:tbl>
       <w:tblPr>
         <w:tblStyle w:val="TableGrid"/>
@@ -15067,7 +15059,63 @@
         <w:pStyle w:val="Heading2"/>
       </w:pPr>
       <w:r>
-        <w:t>5.6 Quick-start Steps</w:t>
+        <w:t xml:space="preserve">5.6 Saved Reports</w:t>
+      </w:r>
+    </w:p>
+    <w:p>
+      <w:pPr>
+        <w:pStyle w:val="Normal"/>
+      </w:pPr>
+      <w:r>
+        <w:t xml:space="preserve">A Saved Reports list shows all reports that have been hard-saved for your projects. From this list you can:</w:t>
+      </w:r>
+    </w:p>
+    <w:p>
+      <w:pPr>
+        <w:pStyle w:val="ListBullet"/>
+      </w:pPr>
+      <w:r>
+        <w:t xml:space="preserve">Browse previously saved reports, shown with their report name, associated project(s), and the date last saved.</w:t>
+      </w:r>
+    </w:p>
+    <w:p>
+      <w:pPr>
+        <w:pStyle w:val="ListBullet"/>
+      </w:pPr>
+      <w:r>
+        <w:t xml:space="preserve">Open any saved report to reload it in the Report Builder — your section layout, field values, and visibility settings are restored exactly as saved.</w:t>
+      </w:r>
+    </w:p>
+    <w:p>
+      <w:pPr>
+        <w:pStyle w:val="ListBullet"/>
+      </w:pPr>
+      <w:r>
+        <w:t xml:space="preserve">Re-export a revisited report to PDF or Word without rebuilding it from scratch.</w:t>
+      </w:r>
+    </w:p>
+    <w:p>
+      <w:pPr>
+        <w:pStyle w:val="ListBullet"/>
+      </w:pPr>
+      <w:r>
+        <w:t xml:space="preserve">Delete a saved report you no longer need.</w:t>
+      </w:r>
+    </w:p>
+    <w:p>
+      <w:pPr>
+        <w:pStyle w:val="Quote"/>
+      </w:pPr>
+      <w:r>
+        <w:t xml:space="preserve">Saved reports capture a snapshot of the data at the time of saving. If you update project data or re-code segments after saving, re-open the report and save again to refresh it.</w:t>
+      </w:r>
+    </w:p>
+    <w:p>
+      <w:pPr>
+        <w:pStyle w:val="Heading2"/>
+      </w:pPr>
+      <w:r>
+        <w:t>5.7 Quick-start Steps</w:t>
       </w:r>
     </w:p>
     <w:p>
@@ -15109,16 +15157,7 @@
         <w:pStyle w:val="ListNumber"/>
       </w:pPr>
       <w:r>
-        <w:t xml:space="preserve">Fill in the </w:t>
-      </w:r>
-      <w:r>
-        <w:rPr>
-          <w:b/>
-        </w:rPr>
-        <w:t>Title</w:t>
-      </w:r>
-      <w:r>
-        <w:t xml:space="preserve"> fields: report title (click heading to edit), OIC IN-CHARGE, PURPOSE, REPORT DATE, IMAGE DATE.</w:t>
+        <w:t>Fill in the Title fields: report title (click heading to edit), OIC IN-CHARGE, PURPOSE, REPORT DATE, IMAGE DATE. The report name is auto-generated from the risk score band; if a filter is active, the filtered name takes precedence.</w:t>
       </w:r>
     </w:p>
     <w:p>
@@ -15185,25 +15224,7 @@
         <w:pStyle w:val="ListNumber"/>
       </w:pPr>
       <w:r>
-        <w:t xml:space="preserve">Click </w:t>
-      </w:r>
-      <w:r>
-        <w:rPr>
-          <w:b/>
-        </w:rPr>
-        <w:t>↓ PDF</w:t>
-      </w:r>
-      <w:r>
-        <w:t xml:space="preserve"> or </w:t>
-      </w:r>
-      <w:r>
-        <w:rPr>
-          <w:b/>
-        </w:rPr>
-        <w:t>↓ Word</w:t>
-      </w:r>
-      <w:r>
-        <w:t xml:space="preserve"> to export.</w:t>
+        <w:t>Click Save Report (hard save) to persist the report for future revisiting, or go straight to ↓ PDF / ↓ Word to export.</w:t>
       </w:r>
     </w:p>
     <w:p>

</xml_diff>